<commit_message>
Update mealpy version to 3.0.3 in requirements.txt
</commit_message>
<xml_diff>
--- a/Documents/CRONOGRAMA DEL PROYECTO.docx
+++ b/Documents/CRONOGRAMA DEL PROYECTO.docx
@@ -148,35 +148,147 @@
         <w:pBdr/>
         <w:spacing w:after="100" w:afterAutospacing="1" w:before="100" w:beforeAutospacing="1" w:line="240" w:lineRule="auto"/>
         <w:ind/>
+        <w:jc w:val="both"/>
         <w:rPr>
           <w:rFonts w:ascii="Times New Roman" w:hAnsi="Times New Roman" w:eastAsia="Times New Roman" w:cs="Times New Roman"/>
+          <w:b w:val="0"/>
+          <w:bCs w:val="0"/>
+          <w:i w:val="0"/>
+          <w:strike w:val="0"/>
           <w:sz w:val="24"/>
           <w:szCs w:val="24"/>
+          <w:highlight w:val="none"/>
+          <w:u w:val="none"/>
           <w:lang w:eastAsia="es-EC"/>
         </w:rPr>
       </w:pPr>
       <w:r>
         <w:rPr>
           <w:rFonts w:ascii="Times New Roman" w:hAnsi="Times New Roman" w:eastAsia="Times New Roman" w:cs="Times New Roman"/>
+          <w:b w:val="0"/>
+          <w:bCs w:val="0"/>
+          <w:i w:val="0"/>
+          <w:iCs w:val="0"/>
+          <w:strike w:val="0"/>
           <w:sz w:val="24"/>
           <w:szCs w:val="24"/>
-          <w:lang w:eastAsia="es-EC"/>
-        </w:rPr>
-        <w:t xml:space="preserve">Diseñar, implementar y evaluar una arquitectura híbrida que combine una metaheurística (GA, PSO, ACO, SA o TS) con una red neuronal artificial (MLP o CNN), comparando su desempeño con un modelo base.</w:t>
-      </w:r>
-      <w:r>
-        <w:rPr>
-          <w:rFonts w:ascii="Times New Roman" w:hAnsi="Times New Roman" w:eastAsia="Times New Roman" w:cs="Times New Roman"/>
-          <w:sz w:val="24"/>
-          <w:szCs w:val="24"/>
+          <w:u w:val="none"/>
           <w:lang w:eastAsia="es-EC"/>
         </w:rPr>
       </w:r>
       <w:r>
         <w:rPr>
           <w:rFonts w:ascii="Times New Roman" w:hAnsi="Times New Roman" w:eastAsia="Times New Roman" w:cs="Times New Roman"/>
+          <w:b w:val="0"/>
+          <w:bCs w:val="0"/>
+          <w:i w:val="0"/>
+          <w:iCs w:val="0"/>
+          <w:strike w:val="0"/>
+          <w:color w:val="000000"/>
+          <w:sz w:val="24"/>
+          <w:u w:val="none"/>
+        </w:rPr>
+        <w:t xml:space="preserve">Diseñar y evaluar un framework de optimización de hiperparámetros híbrido basado en inteligencia de enjambre (GWO-MFO) para modelos de aprendizaje de conjunto (XGBoost), con el fin de maximizar el rendimiento predictivo en métricas sensibles al desbalance </w:t>
+      </w:r>
+      <w:r>
+        <w:rPr>
+          <w:rFonts w:ascii="Times New Roman" w:hAnsi="Times New Roman" w:eastAsia="Times New Roman" w:cs="Times New Roman"/>
+          <w:b w:val="0"/>
+          <w:bCs w:val="0"/>
+          <w:i w:val="0"/>
+          <w:iCs w:val="0"/>
+          <w:strike w:val="0"/>
+          <w:color w:val="000000"/>
+          <w:sz w:val="24"/>
+          <w:u w:val="none"/>
+        </w:rPr>
+        <w:t xml:space="preserve">de clases (PR-AUC y F1-Score), contrastando su eficacia y eficiencia computacional frente a métodos de optimización bayesiana secuencial (Optuna)</w:t>
+      </w:r>
+      <w:r>
+        <w:rPr>
+          <w:rFonts w:ascii="Times New Roman" w:hAnsi="Times New Roman" w:eastAsia="Times New Roman" w:cs="Times New Roman"/>
+          <w:b w:val="0"/>
+          <w:bCs w:val="0"/>
+          <w:i w:val="0"/>
+          <w:iCs w:val="0"/>
+          <w:strike w:val="0"/>
           <w:sz w:val="24"/>
           <w:szCs w:val="24"/>
+          <w:u w:val="none"/>
+          <w:lang w:eastAsia="es-EC"/>
+        </w:rPr>
+      </w:r>
+      <w:r>
+        <w:rPr>
+          <w:rFonts w:ascii="Times New Roman" w:hAnsi="Times New Roman" w:eastAsia="Times New Roman" w:cs="Times New Roman"/>
+          <w:b w:val="0"/>
+          <w:bCs w:val="0"/>
+          <w:i w:val="0"/>
+          <w:strike w:val="0"/>
+          <w:sz w:val="24"/>
+          <w:szCs w:val="24"/>
+          <w:u w:val="none"/>
+        </w:rPr>
+      </w:r>
+    </w:p>
+    <w:p>
+      <w:pPr>
+        <w:pBdr/>
+        <w:spacing w:after="100" w:afterAutospacing="1" w:before="100" w:beforeAutospacing="1" w:line="240" w:lineRule="auto"/>
+        <w:ind/>
+        <w:rPr>
+          <w:rFonts w:ascii="Times New Roman" w:hAnsi="Times New Roman" w:eastAsia="Times New Roman" w:cs="Times New Roman"/>
+          <w:b w:val="0"/>
+          <w:bCs w:val="0"/>
+          <w:i w:val="0"/>
+          <w:strike w:val="0"/>
+          <w:sz w:val="24"/>
+          <w:szCs w:val="24"/>
+          <w:u w:val="none"/>
+        </w:rPr>
+      </w:pPr>
+      <w:r>
+        <w:rPr>
+          <w:rFonts w:ascii="Times New Roman" w:hAnsi="Times New Roman" w:eastAsia="Times New Roman" w:cs="Times New Roman"/>
+          <w:b w:val="0"/>
+          <w:bCs w:val="0"/>
+          <w:i w:val="0"/>
+          <w:iCs w:val="0"/>
+          <w:strike w:val="0"/>
+          <w:sz w:val="24"/>
+          <w:szCs w:val="24"/>
+          <w:highlight w:val="none"/>
+          <w:u w:val="none"/>
+          <w:lang w:eastAsia="es-EC"/>
+        </w:rPr>
+      </w:r>
+      <w:r>
+        <w:rPr>
+          <w:rFonts w:ascii="Times New Roman" w:hAnsi="Times New Roman" w:eastAsia="Times New Roman" w:cs="Times New Roman"/>
+          <w:b w:val="0"/>
+          <w:bCs w:val="0"/>
+          <w:i w:val="0"/>
+          <w:iCs w:val="0"/>
+          <w:strike w:val="0"/>
+          <w:sz w:val="24"/>
+          <w:szCs w:val="24"/>
+          <w:highlight w:val="none"/>
+          <w:u w:val="none"/>
+          <w:lang w:eastAsia="es-EC"/>
+        </w:rPr>
+      </w:r>
+      <w:r>
+        <w:rPr>
+          <w:rFonts w:ascii="Times New Roman" w:hAnsi="Times New Roman" w:eastAsia="Times New Roman" w:cs="Times New Roman"/>
+          <w:b w:val="0"/>
+          <w:bCs w:val="0"/>
+          <w:i w:val="0"/>
+          <w:iCs w:val="0"/>
+          <w:strike w:val="0"/>
+          <w:sz w:val="24"/>
+          <w:szCs w:val="24"/>
+          <w:highlight w:val="none"/>
+          <w:u w:val="none"/>
           <w:lang w:eastAsia="es-EC"/>
         </w:rPr>
       </w:r>
@@ -1604,16 +1716,9 @@
             </w:r>
             <w:r>
               <w:rPr>
-                <w:rFonts w:ascii="Times New Roman" w:hAnsi="Times New Roman" w:eastAsia="Times New Roman" w:cs="Times New Roman"/>
+                <w:rFonts w:ascii="Times New Roman" w:hAnsi="Times New Roman" w:cs="Times New Roman"/>
                 <w:highlight w:val="none"/>
-                <w:lang w:eastAsia="es-EC"/>
-              </w:rPr>
-            </w:r>
-            <w:r>
-              <w:rPr>
-                <w:rFonts w:ascii="Times New Roman" w:hAnsi="Times New Roman" w:eastAsia="Times New Roman" w:cs="Times New Roman"/>
-                <w:highlight w:val="none"/>
-                <w:lang w:eastAsia="es-EC"/>
+                <w14:ligatures w14:val="none"/>
               </w:rPr>
             </w:r>
             <w:r>
@@ -1702,14 +1807,6 @@
                 <w:sz w:val="24"/>
                 <w:szCs w:val="24"/>
                 <w:lang w:val="es-ES"/>
-              </w:rPr>
-            </w:r>
-            <w:r>
-              <w:rPr>
-                <w:rFonts w:ascii="Times New Roman" w:hAnsi="Times New Roman" w:eastAsia="Times New Roman" w:cs="Times New Roman"/>
-                <w:sz w:val="24"/>
-                <w:szCs w:val="24"/>
-                <w:lang w:eastAsia="es-EC"/>
               </w:rPr>
             </w:r>
             <w:r>
@@ -1815,6 +1912,14 @@
                 <w:lang w:val="es-ES"/>
               </w:rPr>
               <w:t xml:space="preserve">23</w:t>
+            </w:r>
+            <w:r>
+              <w:rPr>
+                <w:rFonts w:ascii="Times New Roman" w:hAnsi="Times New Roman" w:eastAsia="Times New Roman" w:cs="Times New Roman"/>
+                <w:sz w:val="24"/>
+                <w:szCs w:val="24"/>
+                <w:lang w:eastAsia="es-EC"/>
+              </w:rPr>
             </w:r>
             <w:r>
               <w:rPr>
@@ -2417,6 +2522,14 @@
                 <w:lang w:eastAsia="es-EC"/>
               </w:rPr>
             </w:r>
+            <w:r>
+              <w:rPr>
+                <w:rFonts w:ascii="Times New Roman" w:hAnsi="Times New Roman" w:eastAsia="Times New Roman" w:cs="Times New Roman"/>
+                <w:sz w:val="24"/>
+                <w:szCs w:val="24"/>
+                <w:lang w:eastAsia="es-EC"/>
+              </w:rPr>
+            </w:r>
           </w:p>
         </w:tc>
       </w:tr>
@@ -2710,6 +2823,14 @@
                 <w:lang w:eastAsia="es-EC"/>
               </w:rPr>
             </w:r>
+            <w:r>
+              <w:rPr>
+                <w:rFonts w:ascii="Times New Roman" w:hAnsi="Times New Roman" w:eastAsia="Times New Roman" w:cs="Times New Roman"/>
+                <w:sz w:val="24"/>
+                <w:szCs w:val="24"/>
+                <w:lang w:eastAsia="es-EC"/>
+              </w:rPr>
+            </w:r>
           </w:p>
         </w:tc>
       </w:tr>
@@ -2808,6 +2929,14 @@
                 <w:lang w:eastAsia="es-EC"/>
               </w:rPr>
               <w:tab/>
+            </w:r>
+            <w:r>
+              <w:rPr>
+                <w:rFonts w:ascii="Times New Roman" w:hAnsi="Times New Roman" w:eastAsia="Times New Roman" w:cs="Times New Roman"/>
+                <w:sz w:val="24"/>
+                <w:szCs w:val="24"/>
+                <w:lang w:eastAsia="es-EC"/>
+              </w:rPr>
             </w:r>
             <w:r>
               <w:rPr>
@@ -3081,6 +3210,14 @@
                 <w:lang w:val="es-ES"/>
               </w:rPr>
               <w:t xml:space="preserve">GWO</w:t>
+            </w:r>
+            <w:r>
+              <w:rPr>
+                <w:rFonts w:ascii="Times New Roman" w:hAnsi="Times New Roman" w:eastAsia="Times New Roman" w:cs="Times New Roman"/>
+                <w:sz w:val="24"/>
+                <w:szCs w:val="24"/>
+                <w:lang w:eastAsia="es-EC"/>
+              </w:rPr>
             </w:r>
             <w:r>
               <w:rPr>
@@ -4038,7 +4175,7 @@
                 <w:rFonts w:ascii="Times New Roman" w:hAnsi="Times New Roman" w:eastAsia="Times New Roman" w:cs="Times New Roman"/>
                 <w:sz w:val="20"/>
                 <w:szCs w:val="20"/>
-                <w:lang w:val="es-ES"/>
+                <w:lang w:eastAsia="es-EC"/>
               </w:rPr>
             </w:r>
             <w:r>

</xml_diff>

<commit_message>
Actualiza el archivo CRONOGRAMA DEL PROYECTO.docx con nueva información
</commit_message>
<xml_diff>
--- a/Documents/CRONOGRAMA DEL PROYECTO.docx
+++ b/Documents/CRONOGRAMA DEL PROYECTO.docx
@@ -210,12 +210,10 @@
           <w:b w:val="0"/>
           <w:bCs w:val="0"/>
           <w:i w:val="0"/>
-          <w:iCs w:val="0"/>
           <w:strike w:val="0"/>
           <w:sz w:val="24"/>
           <w:szCs w:val="24"/>
           <w:u w:val="none"/>
-          <w:lang w:eastAsia="es-EC"/>
         </w:rPr>
       </w:r>
       <w:r>
@@ -227,7 +225,9 @@
           <w:strike w:val="0"/>
           <w:sz w:val="24"/>
           <w:szCs w:val="24"/>
+          <w:highlight w:val="none"/>
           <w:u w:val="none"/>
+          <w:lang w:eastAsia="es-EC"/>
         </w:rPr>
       </w:r>
     </w:p>
@@ -283,13 +283,10 @@
           <w:b w:val="0"/>
           <w:bCs w:val="0"/>
           <w:i w:val="0"/>
-          <w:iCs w:val="0"/>
           <w:strike w:val="0"/>
           <w:sz w:val="24"/>
           <w:szCs w:val="24"/>
-          <w:highlight w:val="none"/>
           <w:u w:val="none"/>
-          <w:lang w:eastAsia="es-EC"/>
         </w:rPr>
       </w:r>
     </w:p>
@@ -2407,17 +2404,9 @@
                 <w:rFonts w:ascii="Times New Roman" w:hAnsi="Times New Roman" w:eastAsia="Times New Roman" w:cs="Times New Roman"/>
                 <w:sz w:val="24"/>
                 <w:szCs w:val="24"/>
-                <w:lang w:eastAsia="es-EC"/>
+                <w:lang w:val="es-ES"/>
               </w:rPr>
-              <w:t xml:space="preserve">MLP (Multilayer Perceptron)</w:t>
-            </w:r>
-            <w:r>
-              <w:rPr>
-                <w:rFonts w:ascii="Times New Roman" w:hAnsi="Times New Roman" w:eastAsia="Times New Roman" w:cs="Times New Roman"/>
-                <w:sz w:val="24"/>
-                <w:szCs w:val="24"/>
-                <w:lang w:eastAsia="es-EC"/>
-              </w:rPr>
+              <w:t xml:space="preserve">XGBoost</w:t>
             </w:r>
             <w:r>
               <w:rPr>
@@ -2510,15 +2499,6 @@
                 <w:rFonts w:ascii="Times New Roman" w:hAnsi="Times New Roman" w:eastAsia="Times New Roman" w:cs="Times New Roman"/>
                 <w:sz w:val="24"/>
                 <w:szCs w:val="24"/>
-                <w:lang w:val="es-ES"/>
-              </w:rPr>
-              <w:t xml:space="preserve">3</w:t>
-            </w:r>
-            <w:r>
-              <w:rPr>
-                <w:rFonts w:ascii="Times New Roman" w:hAnsi="Times New Roman" w:eastAsia="Times New Roman" w:cs="Times New Roman"/>
-                <w:sz w:val="24"/>
-                <w:szCs w:val="24"/>
                 <w:lang w:eastAsia="es-EC"/>
               </w:rPr>
             </w:r>
@@ -2600,15 +2580,6 @@
                 <w:lang w:eastAsia="es-EC"/>
               </w:rPr>
             </w:pPr>
-            <w:r>
-              <w:rPr>
-                <w:rFonts w:ascii="Times New Roman" w:hAnsi="Times New Roman" w:eastAsia="Times New Roman" w:cs="Times New Roman"/>
-                <w:sz w:val="24"/>
-                <w:szCs w:val="24"/>
-                <w:lang w:val="es-ES"/>
-              </w:rPr>
-              <w:t xml:space="preserve">16</w:t>
-            </w:r>
             <w:r>
               <w:rPr>
                 <w:rFonts w:ascii="Times New Roman" w:hAnsi="Times New Roman" w:eastAsia="Times New Roman" w:cs="Times New Roman"/>
@@ -2710,15 +2681,6 @@
                 <w:szCs w:val="24"/>
                 <w:lang w:eastAsia="es-EC"/>
               </w:rPr>
-              <w:t xml:space="preserve">RELU</w:t>
-            </w:r>
-            <w:r>
-              <w:rPr>
-                <w:rFonts w:ascii="Times New Roman" w:hAnsi="Times New Roman" w:eastAsia="Times New Roman" w:cs="Times New Roman"/>
-                <w:sz w:val="24"/>
-                <w:szCs w:val="24"/>
-                <w:lang w:eastAsia="es-EC"/>
-              </w:rPr>
             </w:r>
             <w:r>
               <w:rPr>
@@ -2805,15 +2767,6 @@
                 <w:szCs w:val="24"/>
                 <w:lang w:eastAsia="es-EC"/>
               </w:rPr>
-            </w:r>
-            <w:r>
-              <w:rPr>
-                <w:rFonts w:ascii="Times New Roman" w:hAnsi="Times New Roman" w:eastAsia="Times New Roman" w:cs="Times New Roman"/>
-                <w:sz w:val="24"/>
-                <w:szCs w:val="24"/>
-                <w:lang w:val="es-ES"/>
-              </w:rPr>
-              <w:t xml:space="preserve">0.001</w:t>
             </w:r>
             <w:r>
               <w:rPr>
@@ -2919,7 +2872,7 @@
                 <w:szCs w:val="24"/>
                 <w:lang w:val="es-ES"/>
               </w:rPr>
-              <w:t xml:space="preserve">200</w:t>
+              <w:t xml:space="preserve">15-30</w:t>
             </w:r>
             <w:r>
               <w:rPr>
@@ -3209,7 +3162,7 @@
                 <w:szCs w:val="24"/>
                 <w:lang w:val="es-ES"/>
               </w:rPr>
-              <w:t xml:space="preserve">GWO</w:t>
+              <w:t xml:space="preserve">GWO – MFO</w:t>
             </w:r>
             <w:r>
               <w:rPr>
@@ -3302,17 +3255,20 @@
                 <w:rFonts w:ascii="Times New Roman" w:hAnsi="Times New Roman" w:eastAsia="Times New Roman" w:cs="Times New Roman"/>
                 <w:sz w:val="24"/>
                 <w:szCs w:val="24"/>
-                <w:lang w:eastAsia="es-EC"/>
+                <w:lang w:val="es-ES"/>
               </w:rPr>
+              <w:t xml:space="preserve">(15 - 30) </w:t>
             </w:r>
             <w:r>
               <w:rPr>
                 <w:rFonts w:ascii="Times New Roman" w:hAnsi="Times New Roman" w:eastAsia="Times New Roman" w:cs="Times New Roman"/>
                 <w:sz w:val="24"/>
                 <w:szCs w:val="24"/>
-                <w:lang w:eastAsia="es-EC"/>
+                <w:lang w:val="es-ES"/>
               </w:rPr>
+              <w:t xml:space="preserve">(7 - 9)</w:t>
             </w:r>
+            <w:r/>
             <w:r>
               <w:rPr>
                 <w:rFonts w:ascii="Times New Roman" w:hAnsi="Times New Roman" w:eastAsia="Times New Roman" w:cs="Times New Roman"/>
@@ -3396,8 +3352,9 @@
                 <w:rFonts w:ascii="Times New Roman" w:hAnsi="Times New Roman" w:eastAsia="Times New Roman" w:cs="Times New Roman"/>
                 <w:sz w:val="24"/>
                 <w:szCs w:val="24"/>
-                <w:lang w:eastAsia="es-EC"/>
+                <w:lang w:val="es-ES"/>
               </w:rPr>
+              <w:t xml:space="preserve">20</w:t>
             </w:r>
             <w:r>
               <w:rPr>

</xml_diff>